<commit_message>
Work Knowledge - 10/8/2025 part 4
</commit_message>
<xml_diff>
--- a/Knowledge/3-Work knowledge/1-Software Engineering/1-Testing/4-Multi Sources/Testing Dragons - Manual Testing Using Agile & JIRA/Source.docx
+++ b/Knowledge/3-Work knowledge/1-Software Engineering/1-Testing/4-Multi Sources/Testing Dragons - Manual Testing Using Agile & JIRA/Source.docx
@@ -283,7 +283,29 @@
         <w:t>[</w:t>
       </w:r>
       <w:r>
-        <w:t>Manual Testing with Agile and JIRA - Lecture 0 - Intro to Course</w:t>
+        <w:t xml:space="preserve">Manual Testing with Agile and JIRA - Lecture 1- Intro to Agile, Scrum _ How to </w:t>
+      </w:r>
+      <w:proofErr w:type="spellStart"/>
+      <w:r>
+        <w:t>write_read</w:t>
+      </w:r>
+      <w:proofErr w:type="spellEnd"/>
+      <w:r>
+        <w:t xml:space="preserve"> User Story.mp4</w:t>
+      </w:r>
+      <w:r>
+        <w:t xml:space="preserve"> -&gt; </w:t>
+      </w:r>
+      <w:r>
+        <w:t xml:space="preserve">Lecture 1- Intro to Agile, Scrum _ How to </w:t>
+      </w:r>
+      <w:proofErr w:type="spellStart"/>
+      <w:r>
+        <w:t>write_read</w:t>
+      </w:r>
+      <w:proofErr w:type="spellEnd"/>
+      <w:r>
+        <w:t xml:space="preserve"> User Story.mp4</w:t>
       </w:r>
       <w:r>
         <w:t>] [</w:t>
@@ -345,12 +367,6 @@
             <w:rStyle w:val="Hyperlink"/>
           </w:rPr>
           <w:t xml:space="preserve"> </w:t>
-        </w:r>
-        <w:r>
-          <w:rPr>
-            <w:rStyle w:val="Hyperlink"/>
-          </w:rPr>
-          <w:br/>
         </w:r>
         <w:r>
           <w:rPr>

</xml_diff>

<commit_message>
Work Knowledge - 10/8/2025 part 5
</commit_message>
<xml_diff>
--- a/Knowledge/3-Work knowledge/1-Software Engineering/1-Testing/4-Multi Sources/Testing Dragons - Manual Testing Using Agile & JIRA/Source.docx
+++ b/Knowledge/3-Work knowledge/1-Software Engineering/1-Testing/4-Multi Sources/Testing Dragons - Manual Testing Using Agile & JIRA/Source.docx
@@ -30,10 +30,7 @@
         <w:t>.</w:t>
       </w:r>
       <w:r>
-        <w:t xml:space="preserve"> </w:t>
-      </w:r>
-      <w:r>
-        <w:t>mp4</w:t>
+        <w:t xml:space="preserve"> mp4</w:t>
       </w:r>
       <w:r>
         <w:t>] [</w:t>
@@ -230,16 +227,11 @@
         <w:t>Saved Location</w:t>
       </w:r>
       <w:r>
-        <w:t xml:space="preserve">: web75735 </w:t>
-      </w:r>
-      <w:proofErr w:type="gramStart"/>
-      <w:r>
-        <w:t>\Testing</w:t>
+        <w:t>: web75735 \Testing</w:t>
       </w:r>
       <w:r>
         <w:t>\..</w:t>
       </w:r>
-      <w:proofErr w:type="gramEnd"/>
     </w:p>
     <w:p>
       <w:pPr>
@@ -492,16 +484,254 @@
         <w:t>Saved Location</w:t>
       </w:r>
       <w:r>
-        <w:t xml:space="preserve">: web75735 </w:t>
-      </w:r>
-      <w:proofErr w:type="gramStart"/>
-      <w:r>
-        <w:t>\Testing</w:t>
+        <w:t>: web75735 \Testing</w:t>
       </w:r>
       <w:r>
         <w:t>\..</w:t>
       </w:r>
-      <w:proofErr w:type="gramEnd"/>
+    </w:p>
+    <w:p>
+      <w:pPr>
+        <w:pStyle w:val="ListParagraph"/>
+        <w:rPr>
+          <w:b/>
+          <w:bCs/>
+        </w:rPr>
+      </w:pPr>
+      <w:r>
+        <w:t xml:space="preserve">* </w:t>
+      </w:r>
+      <w:r>
+        <w:rPr>
+          <w:b/>
+          <w:bCs/>
+        </w:rPr>
+        <w:t xml:space="preserve">Notes: </w:t>
+      </w:r>
+    </w:p>
+    <w:p>
+      <w:r>
+        <w:br w:type="page"/>
+      </w:r>
+    </w:p>
+    <w:p>
+      <w:pPr>
+        <w:pStyle w:val="ListParagraph"/>
+        <w:numPr>
+          <w:ilvl w:val="0"/>
+          <w:numId w:val="1"/>
+        </w:numPr>
+      </w:pPr>
+      <w:r>
+        <w:rPr>
+          <w:b/>
+          <w:bCs/>
+        </w:rPr>
+        <w:lastRenderedPageBreak/>
+        <w:t>* Download Name</w:t>
+      </w:r>
+      <w:r>
+        <w:t xml:space="preserve">: </w:t>
+      </w:r>
+      <w:r>
+        <w:t>[</w:t>
+      </w:r>
+      <w:r>
+        <w:t>Manual Testing with Agile and JIRA - Lecture 2- How to Write Test Cases for User Story.mp4</w:t>
+      </w:r>
+      <w:r>
+        <w:t xml:space="preserve"> -&gt; </w:t>
+      </w:r>
+      <w:r>
+        <w:t>Lecture 2- How to Write Test Cases for User Story.mp4</w:t>
+      </w:r>
+      <w:r>
+        <w:t>] [</w:t>
+      </w:r>
+      <w:r>
+        <w:t>Manual Testing with Agile and JIRA - Lecture 2- How to Write Test Cases for User Story</w:t>
+      </w:r>
+      <w:r>
+        <w:t>]</w:t>
+      </w:r>
+      <w:r>
+        <w:br/>
+        <w:t xml:space="preserve">* </w:t>
+      </w:r>
+      <w:r>
+        <w:rPr>
+          <w:b/>
+          <w:bCs/>
+        </w:rPr>
+        <w:t>Download Type</w:t>
+      </w:r>
+      <w:r>
+        <w:t xml:space="preserve">: </w:t>
+      </w:r>
+      <w:r>
+        <w:t>Video</w:t>
+      </w:r>
+      <w:r>
+        <w:br/>
+        <w:t xml:space="preserve">* </w:t>
+      </w:r>
+      <w:r>
+        <w:rPr>
+          <w:b/>
+          <w:bCs/>
+        </w:rPr>
+        <w:t>Source Type</w:t>
+      </w:r>
+      <w:r>
+        <w:t>: Educational</w:t>
+      </w:r>
+      <w:r>
+        <w:br/>
+        <w:t xml:space="preserve">* </w:t>
+      </w:r>
+      <w:r>
+        <w:rPr>
+          <w:b/>
+          <w:bCs/>
+        </w:rPr>
+        <w:t>Download Source</w:t>
+      </w:r>
+      <w:r>
+        <w:t xml:space="preserve">: </w:t>
+      </w:r>
+      <w:hyperlink r:id="rId7" w:history="1">
+        <w:r>
+          <w:rPr>
+            <w:rStyle w:val="Hyperlink"/>
+          </w:rPr>
+          <w:t>https://www.youtube.com/watch?v=cnyGbVOzBSM&amp;list=PLq9CbkUyVZ56qO7Xv2jI7-IVqX4Yw4M9x&amp;index=3</w:t>
+        </w:r>
+      </w:hyperlink>
+      <w:r>
+        <w:br/>
+      </w:r>
+      <w:r>
+        <w:t xml:space="preserve">* </w:t>
+      </w:r>
+      <w:r>
+        <w:rPr>
+          <w:b/>
+          <w:bCs/>
+        </w:rPr>
+        <w:t>Download Server / Mirror:</w:t>
+      </w:r>
+      <w:r>
+        <w:t xml:space="preserve"> YouTube CDN (googlevideo.com)</w:t>
+      </w:r>
+    </w:p>
+    <w:p>
+      <w:pPr>
+        <w:pStyle w:val="ListParagraph"/>
+        <w:rPr>
+          <w:b/>
+          <w:bCs/>
+        </w:rPr>
+      </w:pPr>
+      <w:r>
+        <w:t xml:space="preserve">* </w:t>
+      </w:r>
+      <w:r>
+        <w:rPr>
+          <w:b/>
+          <w:bCs/>
+        </w:rPr>
+        <w:t>Download Method</w:t>
+      </w:r>
+      <w:r>
+        <w:t xml:space="preserve">: </w:t>
+      </w:r>
+      <w:r>
+        <w:t>IDM</w:t>
+      </w:r>
+    </w:p>
+    <w:p>
+      <w:pPr>
+        <w:pStyle w:val="ListParagraph"/>
+      </w:pPr>
+      <w:r>
+        <w:t xml:space="preserve">* </w:t>
+      </w:r>
+      <w:r>
+        <w:rPr>
+          <w:b/>
+          <w:bCs/>
+        </w:rPr>
+        <w:t>Download Format</w:t>
+      </w:r>
+      <w:r>
+        <w:t xml:space="preserve">: </w:t>
+      </w:r>
+      <w:r>
+        <w:t>.mp4</w:t>
+      </w:r>
+      <w:r>
+        <w:br/>
+        <w:t xml:space="preserve">* </w:t>
+      </w:r>
+      <w:r>
+        <w:rPr>
+          <w:b/>
+          <w:bCs/>
+        </w:rPr>
+        <w:t>Download Quality</w:t>
+      </w:r>
+      <w:r>
+        <w:t xml:space="preserve">: </w:t>
+      </w:r>
+      <w:r>
+        <w:t>720</w:t>
+      </w:r>
+      <w:r>
+        <w:t>p HD</w:t>
+      </w:r>
+      <w:r>
+        <w:br/>
+        <w:t xml:space="preserve">* </w:t>
+      </w:r>
+      <w:r>
+        <w:rPr>
+          <w:b/>
+          <w:bCs/>
+        </w:rPr>
+        <w:t>Download Date</w:t>
+      </w:r>
+      <w:r>
+        <w:t xml:space="preserve">: </w:t>
+      </w:r>
+      <w:r>
+        <w:t>10</w:t>
+      </w:r>
+      <w:r>
+        <w:t>/</w:t>
+      </w:r>
+      <w:r>
+        <w:t>8</w:t>
+      </w:r>
+      <w:r>
+        <w:t>/2025</w:t>
+      </w:r>
+      <w:r>
+        <w:br/>
+        <w:t xml:space="preserve">* </w:t>
+      </w:r>
+      <w:r>
+        <w:rPr>
+          <w:b/>
+          <w:bCs/>
+        </w:rPr>
+        <w:t>Saved Location</w:t>
+      </w:r>
+      <w:r>
+        <w:t>: web75735 \Testing</w:t>
+      </w:r>
+      <w:r>
+        <w:t>\..</w:t>
+      </w:r>
     </w:p>
     <w:p>
       <w:pPr>
@@ -536,6 +766,119 @@
 <file path=word/numbering.xml><?xml version="1.0" encoding="utf-8"?>
 <w:numbering xmlns:wpc="http://schemas.microsoft.com/office/word/2010/wordprocessingCanvas" xmlns:cx="http://schemas.microsoft.com/office/drawing/2014/chartex" xmlns:cx1="http://schemas.microsoft.com/office/drawing/2015/9/8/chartex" xmlns:cx2="http://schemas.microsoft.com/office/drawing/2015/10/21/chartex" xmlns:cx3="http://schemas.microsoft.com/office/drawing/2016/5/9/chartex" xmlns:cx4="http://schemas.microsoft.com/office/drawing/2016/5/10/chartex" xmlns:cx5="http://schemas.microsoft.com/office/drawing/2016/5/11/chartex" xmlns:cx6="http://schemas.microsoft.com/office/drawing/2016/5/12/chartex" xmlns:cx7="http://schemas.microsoft.com/office/drawing/2016/5/13/chartex" xmlns:cx8="http://schemas.microsoft.com/office/drawing/2016/5/14/chartex" xmlns:mc="http://schemas.openxmlformats.org/markup-compatibility/2006" xmlns:aink="http://schemas.microsoft.com/office/drawing/2016/ink" xmlns:am3d="http://schemas.microsoft.com/office/drawing/2017/model3d" xmlns:o="urn:schemas-microsoft-com:office:office" xmlns:oel="http://schemas.microsoft.com/office/2019/extlst" xmlns:r="http://schemas.openxmlformats.org/officeDocument/2006/relationships" xmlns:m="http://schemas.openxmlformats.org/officeDocument/2006/math" xmlns:v="urn:schemas-microsoft-com:vml" xmlns:wp14="http://schemas.microsoft.com/office/word/2010/wordprocessingDrawing" xmlns:wp="http://schemas.openxmlformats.org/drawingml/2006/wordprocessingDrawing" xmlns:w10="urn:schemas-microsoft-com:office:word" xmlns:w="http://schemas.openxmlformats.org/wordprocessingml/2006/main" xmlns:w14="http://schemas.microsoft.com/office/word/2010/wordml" xmlns:w15="http://schemas.microsoft.com/office/word/2012/wordml" xmlns:w16cex="http://schemas.microsoft.com/office/word/2018/wordml/cex" xmlns:w16cid="http://schemas.microsoft.com/office/word/2016/wordml/cid" xmlns:w16="http://schemas.microsoft.com/office/word/2018/wordml" xmlns:w16du="http://schemas.microsoft.com/office/word/2023/wordml/word16du" xmlns:w16sdtdh="http://schemas.microsoft.com/office/word/2020/wordml/sdtdatahash" xmlns:w16sdtfl="http://schemas.microsoft.com/office/word/2024/wordml/sdtformatlock" xmlns:w16se="http://schemas.microsoft.com/office/word/2015/wordml/symex" xmlns:wpg="http://schemas.microsoft.com/office/word/2010/wordprocessingGroup" xmlns:wpi="http://schemas.microsoft.com/office/word/2010/wordprocessingInk" xmlns:wne="http://schemas.microsoft.com/office/word/2006/wordml" xmlns:wps="http://schemas.microsoft.com/office/word/2010/wordprocessingShape" mc:Ignorable="w14 w15 w16se w16cid w16 w16cex w16sdtdh w16sdtfl w16du wp14">
   <w:abstractNum w:abstractNumId="0" w15:restartNumberingAfterBreak="0">
+    <w:nsid w:val="105956BE"/>
+    <w:multiLevelType w:val="hybridMultilevel"/>
+    <w:tmpl w:val="F0CC6C48"/>
+    <w:lvl w:ilvl="0" w:tplc="FFFFFFFF">
+      <w:start w:val="1"/>
+      <w:numFmt w:val="decimal"/>
+      <w:lvlText w:val="%1."/>
+      <w:lvlJc w:val="left"/>
+      <w:pPr>
+        <w:ind w:left="720" w:hanging="360"/>
+      </w:pPr>
+      <w:rPr>
+        <w:rFonts w:hint="default"/>
+      </w:rPr>
+    </w:lvl>
+    <w:lvl w:ilvl="1" w:tplc="FFFFFFFF" w:tentative="1">
+      <w:start w:val="1"/>
+      <w:numFmt w:val="bullet"/>
+      <w:lvlText w:val="o"/>
+      <w:lvlJc w:val="left"/>
+      <w:pPr>
+        <w:ind w:left="1440" w:hanging="360"/>
+      </w:pPr>
+      <w:rPr>
+        <w:rFonts w:ascii="Courier New" w:hAnsi="Courier New" w:cs="Courier New" w:hint="default"/>
+      </w:rPr>
+    </w:lvl>
+    <w:lvl w:ilvl="2" w:tplc="FFFFFFFF" w:tentative="1">
+      <w:start w:val="1"/>
+      <w:numFmt w:val="bullet"/>
+      <w:lvlText w:val=""/>
+      <w:lvlJc w:val="left"/>
+      <w:pPr>
+        <w:ind w:left="2160" w:hanging="360"/>
+      </w:pPr>
+      <w:rPr>
+        <w:rFonts w:ascii="Wingdings" w:hAnsi="Wingdings" w:hint="default"/>
+      </w:rPr>
+    </w:lvl>
+    <w:lvl w:ilvl="3" w:tplc="FFFFFFFF" w:tentative="1">
+      <w:start w:val="1"/>
+      <w:numFmt w:val="bullet"/>
+      <w:lvlText w:val=""/>
+      <w:lvlJc w:val="left"/>
+      <w:pPr>
+        <w:ind w:left="2880" w:hanging="360"/>
+      </w:pPr>
+      <w:rPr>
+        <w:rFonts w:ascii="Symbol" w:hAnsi="Symbol" w:hint="default"/>
+      </w:rPr>
+    </w:lvl>
+    <w:lvl w:ilvl="4" w:tplc="FFFFFFFF" w:tentative="1">
+      <w:start w:val="1"/>
+      <w:numFmt w:val="bullet"/>
+      <w:lvlText w:val="o"/>
+      <w:lvlJc w:val="left"/>
+      <w:pPr>
+        <w:ind w:left="3600" w:hanging="360"/>
+      </w:pPr>
+      <w:rPr>
+        <w:rFonts w:ascii="Courier New" w:hAnsi="Courier New" w:cs="Courier New" w:hint="default"/>
+      </w:rPr>
+    </w:lvl>
+    <w:lvl w:ilvl="5" w:tplc="FFFFFFFF" w:tentative="1">
+      <w:start w:val="1"/>
+      <w:numFmt w:val="bullet"/>
+      <w:lvlText w:val=""/>
+      <w:lvlJc w:val="left"/>
+      <w:pPr>
+        <w:ind w:left="4320" w:hanging="360"/>
+      </w:pPr>
+      <w:rPr>
+        <w:rFonts w:ascii="Wingdings" w:hAnsi="Wingdings" w:hint="default"/>
+      </w:rPr>
+    </w:lvl>
+    <w:lvl w:ilvl="6" w:tplc="FFFFFFFF" w:tentative="1">
+      <w:start w:val="1"/>
+      <w:numFmt w:val="bullet"/>
+      <w:lvlText w:val=""/>
+      <w:lvlJc w:val="left"/>
+      <w:pPr>
+        <w:ind w:left="5040" w:hanging="360"/>
+      </w:pPr>
+      <w:rPr>
+        <w:rFonts w:ascii="Symbol" w:hAnsi="Symbol" w:hint="default"/>
+      </w:rPr>
+    </w:lvl>
+    <w:lvl w:ilvl="7" w:tplc="FFFFFFFF" w:tentative="1">
+      <w:start w:val="1"/>
+      <w:numFmt w:val="bullet"/>
+      <w:lvlText w:val="o"/>
+      <w:lvlJc w:val="left"/>
+      <w:pPr>
+        <w:ind w:left="5760" w:hanging="360"/>
+      </w:pPr>
+      <w:rPr>
+        <w:rFonts w:ascii="Courier New" w:hAnsi="Courier New" w:cs="Courier New" w:hint="default"/>
+      </w:rPr>
+    </w:lvl>
+    <w:lvl w:ilvl="8" w:tplc="FFFFFFFF" w:tentative="1">
+      <w:start w:val="1"/>
+      <w:numFmt w:val="bullet"/>
+      <w:lvlText w:val=""/>
+      <w:lvlJc w:val="left"/>
+      <w:pPr>
+        <w:ind w:left="6480" w:hanging="360"/>
+      </w:pPr>
+      <w:rPr>
+        <w:rFonts w:ascii="Wingdings" w:hAnsi="Wingdings" w:hint="default"/>
+      </w:rPr>
+    </w:lvl>
+  </w:abstractNum>
+  <w:abstractNum w:abstractNumId="1" w15:restartNumberingAfterBreak="0">
     <w:nsid w:val="39930AB2"/>
     <w:multiLevelType w:val="hybridMultilevel"/>
     <w:tmpl w:val="F0CC6C48"/>
@@ -649,6 +992,9 @@
     </w:lvl>
   </w:abstractNum>
   <w:num w:numId="1" w16cid:durableId="1029840764">
+    <w:abstractNumId w:val="1"/>
+  </w:num>
+  <w:num w:numId="2" w16cid:durableId="181169805">
     <w:abstractNumId w:val="0"/>
   </w:num>
 </w:numbering>

</xml_diff>

<commit_message>
Work Knowledge - 10/9/2025 part 3
</commit_message>
<xml_diff>
--- a/Knowledge/3-Work knowledge/1-Software Engineering/1-Testing/4-Multi Sources/Testing Dragons - Manual Testing Using Agile & JIRA/Source.docx
+++ b/Knowledge/3-Work knowledge/1-Software Engineering/1-Testing/4-Multi Sources/Testing Dragons - Manual Testing Using Agile & JIRA/Source.docx
@@ -711,6 +711,246 @@
       </w:r>
       <w:r>
         <w:t>8</w:t>
+      </w:r>
+      <w:r>
+        <w:t>/2025</w:t>
+      </w:r>
+      <w:r>
+        <w:br/>
+        <w:t xml:space="preserve">* </w:t>
+      </w:r>
+      <w:r>
+        <w:rPr>
+          <w:b/>
+          <w:bCs/>
+        </w:rPr>
+        <w:t>Saved Location</w:t>
+      </w:r>
+      <w:r>
+        <w:t>: web75735 \Testing</w:t>
+      </w:r>
+      <w:r>
+        <w:t>\..</w:t>
+      </w:r>
+    </w:p>
+    <w:p>
+      <w:pPr>
+        <w:pStyle w:val="ListParagraph"/>
+        <w:rPr>
+          <w:b/>
+          <w:bCs/>
+        </w:rPr>
+      </w:pPr>
+      <w:r>
+        <w:t xml:space="preserve">* </w:t>
+      </w:r>
+      <w:r>
+        <w:rPr>
+          <w:b/>
+          <w:bCs/>
+        </w:rPr>
+        <w:t xml:space="preserve">Notes: </w:t>
+      </w:r>
+    </w:p>
+    <w:p/>
+    <w:p>
+      <w:pPr>
+        <w:pStyle w:val="ListParagraph"/>
+        <w:numPr>
+          <w:ilvl w:val="0"/>
+          <w:numId w:val="1"/>
+        </w:numPr>
+      </w:pPr>
+      <w:r>
+        <w:rPr>
+          <w:b/>
+          <w:bCs/>
+        </w:rPr>
+        <w:t>* Download Name</w:t>
+      </w:r>
+      <w:r>
+        <w:t xml:space="preserve">: </w:t>
+      </w:r>
+      <w:r>
+        <w:t>[</w:t>
+      </w:r>
+      <w:r>
+        <w:t>Manual Testing with Agile and JIRA - Lecture 3 - How to run Test and How report the bugs on JIRA.mp4</w:t>
+      </w:r>
+      <w:r>
+        <w:t xml:space="preserve"> -&gt; </w:t>
+      </w:r>
+      <w:r>
+        <w:t>Lecture 3 - How to run Test and How report the bugs on JIRA.mp4</w:t>
+      </w:r>
+      <w:r>
+        <w:t>] [</w:t>
+      </w:r>
+      <w:r>
+        <w:t>Manual Testing with Agile and JIRA - Lecture 3 - How to run Test and How report the bugs on JIRA</w:t>
+      </w:r>
+      <w:r>
+        <w:t>]</w:t>
+      </w:r>
+      <w:r>
+        <w:br/>
+        <w:t xml:space="preserve">* </w:t>
+      </w:r>
+      <w:r>
+        <w:rPr>
+          <w:b/>
+          <w:bCs/>
+        </w:rPr>
+        <w:t>Download Type</w:t>
+      </w:r>
+      <w:r>
+        <w:t xml:space="preserve">: </w:t>
+      </w:r>
+      <w:r>
+        <w:t>Video</w:t>
+      </w:r>
+      <w:r>
+        <w:br/>
+        <w:t xml:space="preserve">* </w:t>
+      </w:r>
+      <w:r>
+        <w:rPr>
+          <w:b/>
+          <w:bCs/>
+        </w:rPr>
+        <w:t>Source Type</w:t>
+      </w:r>
+      <w:r>
+        <w:t>: Educational</w:t>
+      </w:r>
+      <w:r>
+        <w:br/>
+        <w:t xml:space="preserve">* </w:t>
+      </w:r>
+      <w:r>
+        <w:rPr>
+          <w:b/>
+          <w:bCs/>
+        </w:rPr>
+        <w:t>Download Source</w:t>
+      </w:r>
+      <w:r>
+        <w:t xml:space="preserve">: </w:t>
+      </w:r>
+      <w:hyperlink r:id="rId8" w:history="1">
+        <w:r>
+          <w:rPr>
+            <w:rStyle w:val="Hyperlink"/>
+          </w:rPr>
+          <w:t>https://www.youtube.com/watch?v=EW5p341dSA0&amp;list=PLq9CbkUyVZ56qO7Xv2jI7-IVqX4Yw4M9x&amp;index=5</w:t>
+        </w:r>
+      </w:hyperlink>
+      <w:r>
+        <w:t xml:space="preserve"> </w:t>
+      </w:r>
+      <w:r>
+        <w:br/>
+        <w:t xml:space="preserve">* </w:t>
+      </w:r>
+      <w:r>
+        <w:rPr>
+          <w:b/>
+          <w:bCs/>
+        </w:rPr>
+        <w:t>Download Server / Mirror:</w:t>
+      </w:r>
+      <w:r>
+        <w:t xml:space="preserve"> YouTube CDN (googlevideo.com)</w:t>
+      </w:r>
+    </w:p>
+    <w:p>
+      <w:pPr>
+        <w:pStyle w:val="ListParagraph"/>
+        <w:rPr>
+          <w:b/>
+          <w:bCs/>
+        </w:rPr>
+      </w:pPr>
+      <w:r>
+        <w:t xml:space="preserve">* </w:t>
+      </w:r>
+      <w:r>
+        <w:rPr>
+          <w:b/>
+          <w:bCs/>
+        </w:rPr>
+        <w:t>Download Method</w:t>
+      </w:r>
+      <w:r>
+        <w:t xml:space="preserve">: </w:t>
+      </w:r>
+      <w:r>
+        <w:t>IDM</w:t>
+      </w:r>
+    </w:p>
+    <w:p>
+      <w:pPr>
+        <w:pStyle w:val="ListParagraph"/>
+      </w:pPr>
+      <w:r>
+        <w:t xml:space="preserve">* </w:t>
+      </w:r>
+      <w:r>
+        <w:rPr>
+          <w:b/>
+          <w:bCs/>
+        </w:rPr>
+        <w:t>Download Format</w:t>
+      </w:r>
+      <w:r>
+        <w:t xml:space="preserve">: </w:t>
+      </w:r>
+      <w:r>
+        <w:t>.mp4</w:t>
+      </w:r>
+      <w:r>
+        <w:br/>
+      </w:r>
+      <w:r>
+        <w:t xml:space="preserve">* </w:t>
+      </w:r>
+      <w:r>
+        <w:rPr>
+          <w:b/>
+          <w:bCs/>
+        </w:rPr>
+        <w:t>Download Quality</w:t>
+      </w:r>
+      <w:r>
+        <w:t xml:space="preserve">: </w:t>
+      </w:r>
+      <w:r>
+        <w:t>1080p HD</w:t>
+      </w:r>
+      <w:r>
+        <w:br/>
+      </w:r>
+      <w:r>
+        <w:t xml:space="preserve">* </w:t>
+      </w:r>
+      <w:r>
+        <w:rPr>
+          <w:b/>
+          <w:bCs/>
+        </w:rPr>
+        <w:t>Download Date</w:t>
+      </w:r>
+      <w:r>
+        <w:t xml:space="preserve">: </w:t>
+      </w:r>
+      <w:r>
+        <w:t>10</w:t>
+      </w:r>
+      <w:r>
+        <w:t>/</w:t>
+      </w:r>
+      <w:r>
+        <w:t>9</w:t>
       </w:r>
       <w:r>
         <w:t>/2025</w:t>

</xml_diff>

<commit_message>
Work Knowledge - 10/9/2025 part 5
</commit_message>
<xml_diff>
--- a/Knowledge/3-Work knowledge/1-Software Engineering/1-Testing/4-Multi Sources/Testing Dragons - Manual Testing Using Agile & JIRA/Source.docx
+++ b/Knowledge/3-Work knowledge/1-Software Engineering/1-Testing/4-Multi Sources/Testing Dragons - Manual Testing Using Agile & JIRA/Source.docx
@@ -931,6 +931,244 @@
         <w:br/>
       </w:r>
       <w:r>
+        <w:t xml:space="preserve">* </w:t>
+      </w:r>
+      <w:r>
+        <w:rPr>
+          <w:b/>
+          <w:bCs/>
+        </w:rPr>
+        <w:t>Download Date</w:t>
+      </w:r>
+      <w:r>
+        <w:t xml:space="preserve">: </w:t>
+      </w:r>
+      <w:r>
+        <w:t>10</w:t>
+      </w:r>
+      <w:r>
+        <w:t>/</w:t>
+      </w:r>
+      <w:r>
+        <w:t>9</w:t>
+      </w:r>
+      <w:r>
+        <w:t>/2025</w:t>
+      </w:r>
+      <w:r>
+        <w:br/>
+        <w:t xml:space="preserve">* </w:t>
+      </w:r>
+      <w:r>
+        <w:rPr>
+          <w:b/>
+          <w:bCs/>
+        </w:rPr>
+        <w:t>Saved Location</w:t>
+      </w:r>
+      <w:r>
+        <w:t>: web75735 \Testing</w:t>
+      </w:r>
+      <w:r>
+        <w:t>\..</w:t>
+      </w:r>
+    </w:p>
+    <w:p>
+      <w:pPr>
+        <w:pStyle w:val="ListParagraph"/>
+        <w:rPr>
+          <w:b/>
+          <w:bCs/>
+        </w:rPr>
+      </w:pPr>
+      <w:r>
+        <w:t xml:space="preserve">* </w:t>
+      </w:r>
+      <w:r>
+        <w:rPr>
+          <w:b/>
+          <w:bCs/>
+        </w:rPr>
+        <w:t xml:space="preserve">Notes: </w:t>
+      </w:r>
+    </w:p>
+    <w:p/>
+    <w:p/>
+    <w:p/>
+    <w:p>
+      <w:pPr>
+        <w:pStyle w:val="ListParagraph"/>
+        <w:numPr>
+          <w:ilvl w:val="0"/>
+          <w:numId w:val="1"/>
+        </w:numPr>
+      </w:pPr>
+      <w:r>
+        <w:rPr>
+          <w:b/>
+          <w:bCs/>
+        </w:rPr>
+        <w:lastRenderedPageBreak/>
+        <w:t>* Download Name</w:t>
+      </w:r>
+      <w:r>
+        <w:t xml:space="preserve">: </w:t>
+      </w:r>
+      <w:r>
+        <w:t>[</w:t>
+      </w:r>
+      <w:r>
+        <w:t>Manual Testing with Agile and JIRA - Lecture 4 -Jira structure and objects.mp4</w:t>
+      </w:r>
+      <w:r>
+        <w:t xml:space="preserve"> -&gt; </w:t>
+      </w:r>
+      <w:r>
+        <w:t>Lecture 4 -Jira structure and objects.mp4</w:t>
+      </w:r>
+      <w:r>
+        <w:t>] [</w:t>
+      </w:r>
+      <w:r>
+        <w:t>Manual Testing with Agile and JIRA - Lecture 4 -Jira structure and objects</w:t>
+      </w:r>
+      <w:r>
+        <w:t>]</w:t>
+      </w:r>
+      <w:r>
+        <w:br/>
+        <w:t xml:space="preserve">* </w:t>
+      </w:r>
+      <w:r>
+        <w:rPr>
+          <w:b/>
+          <w:bCs/>
+        </w:rPr>
+        <w:t>Download Type</w:t>
+      </w:r>
+      <w:r>
+        <w:t xml:space="preserve">: </w:t>
+      </w:r>
+      <w:r>
+        <w:t>Video</w:t>
+      </w:r>
+      <w:r>
+        <w:br/>
+        <w:t xml:space="preserve">* </w:t>
+      </w:r>
+      <w:r>
+        <w:rPr>
+          <w:b/>
+          <w:bCs/>
+        </w:rPr>
+        <w:t>Source Type</w:t>
+      </w:r>
+      <w:r>
+        <w:t>: Educational</w:t>
+      </w:r>
+      <w:r>
+        <w:br/>
+        <w:t xml:space="preserve">* </w:t>
+      </w:r>
+      <w:r>
+        <w:rPr>
+          <w:b/>
+          <w:bCs/>
+        </w:rPr>
+        <w:t>Download Source</w:t>
+      </w:r>
+      <w:r>
+        <w:t xml:space="preserve">: </w:t>
+      </w:r>
+      <w:hyperlink r:id="rId9" w:history="1">
+        <w:r>
+          <w:rPr>
+            <w:rStyle w:val="Hyperlink"/>
+          </w:rPr>
+          <w:t>https://www.youtube.com/watch?v=YXNAREXLh6k&amp;list=PLq9CbkUyVZ56qO7Xv2jI7-IVqX4Yw4M9x&amp;index=6</w:t>
+        </w:r>
+      </w:hyperlink>
+      <w:r>
+        <w:br/>
+      </w:r>
+      <w:r>
+        <w:t xml:space="preserve">* </w:t>
+      </w:r>
+      <w:r>
+        <w:rPr>
+          <w:b/>
+          <w:bCs/>
+        </w:rPr>
+        <w:t>Download Server / Mirror:</w:t>
+      </w:r>
+      <w:r>
+        <w:t xml:space="preserve"> YouTube CDN (googlevideo.com)</w:t>
+      </w:r>
+    </w:p>
+    <w:p>
+      <w:pPr>
+        <w:pStyle w:val="ListParagraph"/>
+        <w:rPr>
+          <w:b/>
+          <w:bCs/>
+        </w:rPr>
+      </w:pPr>
+      <w:r>
+        <w:t xml:space="preserve">* </w:t>
+      </w:r>
+      <w:r>
+        <w:rPr>
+          <w:b/>
+          <w:bCs/>
+        </w:rPr>
+        <w:t>Download Method</w:t>
+      </w:r>
+      <w:r>
+        <w:t xml:space="preserve">: </w:t>
+      </w:r>
+      <w:r>
+        <w:t>IDM</w:t>
+      </w:r>
+    </w:p>
+    <w:p>
+      <w:pPr>
+        <w:pStyle w:val="ListParagraph"/>
+      </w:pPr>
+      <w:r>
+        <w:t xml:space="preserve">* </w:t>
+      </w:r>
+      <w:r>
+        <w:rPr>
+          <w:b/>
+          <w:bCs/>
+        </w:rPr>
+        <w:t>Download Format</w:t>
+      </w:r>
+      <w:r>
+        <w:t xml:space="preserve">: </w:t>
+      </w:r>
+      <w:r>
+        <w:t>.mp4</w:t>
+      </w:r>
+      <w:r>
+        <w:br/>
+        <w:t xml:space="preserve">* </w:t>
+      </w:r>
+      <w:r>
+        <w:rPr>
+          <w:b/>
+          <w:bCs/>
+        </w:rPr>
+        <w:t>Download Quality</w:t>
+      </w:r>
+      <w:r>
+        <w:t xml:space="preserve">: </w:t>
+      </w:r>
+      <w:r>
+        <w:t>1080p HD</w:t>
+      </w:r>
+      <w:r>
+        <w:br/>
         <w:t xml:space="preserve">* </w:t>
       </w:r>
       <w:r>
@@ -1843,6 +2081,7 @@
   <w:style w:type="character" w:default="1" w:styleId="DefaultParagraphFont">
     <w:name w:val="Default Paragraph Font"/>
     <w:uiPriority w:val="1"/>
+    <w:semiHidden/>
     <w:unhideWhenUsed/>
   </w:style>
   <w:style w:type="table" w:default="1" w:styleId="TableNormal">

</xml_diff>